<commit_message>
Normalize footnote reference formatting
</commit_message>
<xml_diff>
--- a/1952.1/1952年1月1日，与华罗庚的谈话__LLM初注.docx
+++ b/1952.1/1952年1月1日，与华罗庚的谈话__LLM初注.docx
@@ -51,13 +51,16 @@
       </w:r>
       <w:r>
         <w:rPr>
+          <w:rStyle w:val="FootnoteReference"/>
           <w:rFonts w:hint="eastAsia" w:ascii="仿宋" w:hAnsi="仿宋" w:eastAsia="仿宋" w:cs="仿宋"/>
           <w:sz w:val="36"/>
           <w:szCs w:val="36"/>
           <w:vertAlign w:val="superscript"/>
           <w:lang w:val="en-US" w:eastAsia="zh-CN"/>
         </w:rPr>
+        <w:t>[</w:t>
         <w:footnoteReference w:id="0"/>
+        <w:t>]</w:t>
       </w:r>
       <w:r>
         <w:rPr>
@@ -354,11 +357,18 @@
       <w:r>
         <w:rPr>
           <w:rStyle w:val="FootnoteReference"/>
-        </w:rPr>
+          <w:vertAlign w:val="superscript"/>
+        </w:rPr>
+        <w:t>[</w:t>
         <w:footnoteReference w:id="4"/>
-      </w:r>
-      <w:r>
-        <w:rPr/>
+        <w:t>]</w:t>
+      </w:r>
+      <w:r>
+        <w:rPr>
+          <w:rFonts w:hint="eastAsia" w:ascii="仿宋" w:hAnsi="仿宋" w:eastAsia="仿宋"/>
+          <w:sz w:val="32"/>
+          <w:szCs w:val="32"/>
+        </w:rPr>
         <w:t xml:space="preserve">也不时插上几句话。</w:t>
       </w:r>
       <w:r>

</xml_diff>

<commit_message>
Stabilize visible footnote markers
</commit_message>
<xml_diff>
--- a/1952.1/1952年1月1日，与华罗庚的谈话__LLM初注.docx
+++ b/1952.1/1952年1月1日，与华罗庚的谈话__LLM初注.docx
@@ -41,36 +41,19 @@
       <w:bookmarkEnd w:id="0"/>
       <w:r>
         <w:rPr>
-          <w:rFonts w:hint="eastAsia" w:ascii="仿宋" w:hAnsi="仿宋" w:eastAsia="仿宋" w:cs="仿宋"/>
-          <w:sz w:val="36"/>
-          <w:szCs w:val="36"/>
+          <w:rStyle w:val="FootnoteReference"/>
           <w:vertAlign w:val="superscript"/>
-          <w:lang w:val="en-US" w:eastAsia="zh-CN"/>
-        </w:rPr>
-        <w:t>[</w:t>
+        </w:rPr>
+        <w:t>[1]</w:t>
       </w:r>
       <w:r>
         <w:rPr>
           <w:rStyle w:val="FootnoteReference"/>
-          <w:rFonts w:hint="eastAsia" w:ascii="仿宋" w:hAnsi="仿宋" w:eastAsia="仿宋" w:cs="仿宋"/>
-          <w:sz w:val="36"/>
-          <w:szCs w:val="36"/>
           <w:vertAlign w:val="superscript"/>
-          <w:lang w:val="en-US" w:eastAsia="zh-CN"/>
-        </w:rPr>
-        <w:t>[</w:t>
+          <w:vanish/>
+          <w:specVanish/>
+        </w:rPr>
         <w:footnoteReference w:id="0"/>
-        <w:t>]</w:t>
-      </w:r>
-      <w:r>
-        <w:rPr>
-          <w:rFonts w:hint="eastAsia" w:ascii="仿宋" w:hAnsi="仿宋" w:eastAsia="仿宋" w:cs="仿宋"/>
-          <w:sz w:val="36"/>
-          <w:szCs w:val="36"/>
-          <w:vertAlign w:val="superscript"/>
-          <w:lang w:val="en-US" w:eastAsia="zh-CN"/>
-        </w:rPr>
-        <w:t>]</w:t>
       </w:r>
     </w:p>
     <w:p>
@@ -359,9 +342,16 @@
           <w:rStyle w:val="FootnoteReference"/>
           <w:vertAlign w:val="superscript"/>
         </w:rPr>
-        <w:t>[</w:t>
+        <w:t>[2]</w:t>
+      </w:r>
+      <w:r>
+        <w:rPr>
+          <w:rStyle w:val="FootnoteReference"/>
+          <w:vertAlign w:val="superscript"/>
+          <w:vanish/>
+          <w:specVanish/>
+        </w:rPr>
         <w:footnoteReference w:id="4"/>
-        <w:t>]</w:t>
       </w:r>
       <w:r>
         <w:rPr>
@@ -618,13 +608,39 @@
       </w:pPr>
       <w:r>
         <w:rPr>
+          <w:rStyle w:val="FootnoteReference"/>
+        </w:rPr>
+        <w:t>[1]</w:t>
+      </w:r>
+      <w:r>
+        <w:rPr>
+          <w:rFonts w:hint="eastAsia" w:asciiTheme="minorEastAsia" w:hAnsiTheme="minorEastAsia" w:cstheme="minorBidi"/>
+          <w:kern w:val="2"/>
+          <w:sz w:val="21"/>
+          <w:szCs w:val="21"/>
+          <w:lang w:val="en-US" w:eastAsia="zh-CN" w:bidi="ar-SA"/>
+        </w:rPr>
+        <w:t>关于这个谈话的真实性及时间还存在争议，《</w:t>
+      </w:r>
+      <w:r>
+        <w:rPr>
           <w:rFonts w:hint="eastAsia" w:asciiTheme="minorEastAsia" w:hAnsiTheme="minorEastAsia" w:eastAsiaTheme="minorEastAsia" w:cstheme="minorBidi"/>
           <w:kern w:val="2"/>
           <w:sz w:val="21"/>
           <w:szCs w:val="21"/>
           <w:lang w:val="en-US" w:eastAsia="zh-CN" w:bidi="ar-SA"/>
         </w:rPr>
-        <w:t>[</w:t>
+        <w:t>毛泽东年谱</w:t>
+      </w:r>
+      <w:r>
+        <w:rPr>
+          <w:rFonts w:hint="eastAsia" w:asciiTheme="minorEastAsia" w:hAnsiTheme="minorEastAsia" w:cstheme="minorBidi"/>
+          <w:kern w:val="2"/>
+          <w:sz w:val="21"/>
+          <w:szCs w:val="21"/>
+          <w:lang w:val="en-US" w:eastAsia="zh-CN" w:bidi="ar-SA"/>
+        </w:rPr>
+        <w:t>》中并未记载。</w:t>
       </w:r>
       <w:r>
         <w:rPr>
@@ -634,17 +650,7 @@
           <w:szCs w:val="21"/>
           <w:lang w:val="en-US" w:eastAsia="zh-CN" w:bidi="ar-SA"/>
         </w:rPr>
-        <w:footnoteRef/>
-      </w:r>
-      <w:r>
-        <w:rPr>
-          <w:rFonts w:hint="eastAsia" w:asciiTheme="minorEastAsia" w:hAnsiTheme="minorEastAsia" w:eastAsiaTheme="minorEastAsia" w:cstheme="minorBidi"/>
-          <w:kern w:val="2"/>
-          <w:sz w:val="21"/>
-          <w:szCs w:val="21"/>
-          <w:lang w:val="en-US" w:eastAsia="zh-CN" w:bidi="ar-SA"/>
-        </w:rPr>
-        <w:t>]</w:t>
+        <w:t>本文是根据</w:t>
       </w:r>
       <w:r>
         <w:rPr>
@@ -654,46 +660,6 @@
           <w:szCs w:val="21"/>
           <w:lang w:val="en-US" w:eastAsia="zh-CN" w:bidi="ar-SA"/>
         </w:rPr>
-        <w:t>关于这个谈话的真实性及时间还存在争议，《</w:t>
-      </w:r>
-      <w:r>
-        <w:rPr>
-          <w:rFonts w:hint="eastAsia" w:asciiTheme="minorEastAsia" w:hAnsiTheme="minorEastAsia" w:eastAsiaTheme="minorEastAsia" w:cstheme="minorBidi"/>
-          <w:kern w:val="2"/>
-          <w:sz w:val="21"/>
-          <w:szCs w:val="21"/>
-          <w:lang w:val="en-US" w:eastAsia="zh-CN" w:bidi="ar-SA"/>
-        </w:rPr>
-        <w:t>毛泽东年谱</w:t>
-      </w:r>
-      <w:r>
-        <w:rPr>
-          <w:rFonts w:hint="eastAsia" w:asciiTheme="minorEastAsia" w:hAnsiTheme="minorEastAsia" w:cstheme="minorBidi"/>
-          <w:kern w:val="2"/>
-          <w:sz w:val="21"/>
-          <w:szCs w:val="21"/>
-          <w:lang w:val="en-US" w:eastAsia="zh-CN" w:bidi="ar-SA"/>
-        </w:rPr>
-        <w:t>》中并未记载。</w:t>
-      </w:r>
-      <w:r>
-        <w:rPr>
-          <w:rFonts w:hint="eastAsia" w:asciiTheme="minorEastAsia" w:hAnsiTheme="minorEastAsia" w:eastAsiaTheme="minorEastAsia" w:cstheme="minorBidi"/>
-          <w:kern w:val="2"/>
-          <w:sz w:val="21"/>
-          <w:szCs w:val="21"/>
-          <w:lang w:val="en-US" w:eastAsia="zh-CN" w:bidi="ar-SA"/>
-        </w:rPr>
-        <w:t>本文是根据</w:t>
-      </w:r>
-      <w:r>
-        <w:rPr>
-          <w:rFonts w:hint="eastAsia" w:asciiTheme="minorEastAsia" w:hAnsiTheme="minorEastAsia" w:cstheme="minorBidi"/>
-          <w:kern w:val="2"/>
-          <w:sz w:val="21"/>
-          <w:szCs w:val="21"/>
-          <w:lang w:val="en-US" w:eastAsia="zh-CN" w:bidi="ar-SA"/>
-        </w:rPr>
         <w:t>东方直心同志编著的《毛泽东大传》（2021年终极版）第六卷，第2067页记载内容编辑而成。标题为编者所加。华罗庚，1910年11月12日出生于江苏省常州金坛县一个贫民家庭，读完初中，他便进入职业学校学习，由于交不起学费，读了一年半只好辍学，一边在父亲的杂货店里帮忙，一边自学数学，1930年写出了论文《苏家驹之代数的五次方程式解法不能成立的理由》，刊登在上海《科学》杂志上，轰动了中国数学界。清华大学数学系主任熊庆来请华罗庚到清华大学工作和深造；后来，华罗庚又到英国剑桥大学研究和深造。1938年，他回国后被聘为昆明西南联大教授，写下了《堆垒素数论》。1946年，华罗庚到美国普林斯顿大学为客籍教授、伊利诺伊大学教授。新中国成立后，华罗庚毅然归国，担任清华大学数学系主任、教授。</w:t>
       </w:r>
     </w:p>
@@ -711,13 +677,9 @@
       </w:pPr>
       <w:r>
         <w:rPr>
-          <w:rFonts w:asciiTheme="minorEastAsia" w:hAnsiTheme="minorEastAsia" w:eastAsiaTheme="minorEastAsia" w:cstheme="minorBidi"/>
-          <w:kern w:val="2"/>
-          <w:sz w:val="21"/>
-          <w:szCs w:val="21"/>
-          <w:lang w:val="en-US" w:eastAsia="zh-CN" w:bidi="ar-SA"/>
-        </w:rPr>
-        <w:footnoteRef/>
+          <w:rStyle w:val="FootnoteReference"/>
+        </w:rPr>
+        <w:t>[2]</w:t>
       </w:r>
       <w:r>
         <w:rPr>

</xml_diff>